<commit_message>
Thêm ảnh thạch nhũ (Việt hóa) và vòi nước/bập bênh, cập nhật zip ảnh đã duyệt
Co-Authored-By: Claude Opus 5.5 <noreply@anthropic.com>
Claude-Session: https://claude.ai/code/session_01YToDWK6Q41xkdnJbBz9Sbt
</commit_message>
<xml_diff>
--- a/Can bang hoa hoc/Danh sách ảnh và nguồn.docx
+++ b/Can bang hoa hoc/Danh sách ảnh và nguồn.docx
@@ -228,7 +228,7 @@
           </w:tcPr>
           <w:p>
             <w:r>
-              <w:t>Chờ Gemini dịch nhãn</w:t>
+              <w:t>✓ Đã Việt hóa, làm nét</w:t>
             </w:r>
           </w:p>
         </w:tc>
@@ -280,7 +280,7 @@
           </w:tcPr>
           <w:p>
             <w:r>
-              <w:t>Chờ Gemini vẽ lại theo mẫu</w:t>
+              <w:t>✓ Đã vẽ lại theo mẫu</w:t>
             </w:r>
           </w:p>
         </w:tc>

</xml_diff>

<commit_message>
Gộp danh mục ảnh vào một script; thêm ảnh Q-K, bộ xúc tác (sửa nhãn), nổ bóng H2
Co-Authored-By: Claude Opus 5.5 <noreply@anthropic.com>
Claude-Session: https://claude.ai/code/session_01YToDWK6Q41xkdnJbBz9Sbt
</commit_message>
<xml_diff>
--- a/Can bang hoa hoc/Danh sách ảnh và nguồn.docx
+++ b/Can bang hoa hoc/Danh sách ảnh và nguồn.docx
@@ -21,16 +21,45 @@
         <w:tblLook w:firstColumn="1" w:firstRow="1" w:lastColumn="0" w:lastRow="0" w:noHBand="0" w:noVBand="1" w:val="04A0"/>
       </w:tblPr>
       <w:tblGrid>
-        <w:gridCol w:w="2914"/>
-        <w:gridCol w:w="2914"/>
-        <w:gridCol w:w="2914"/>
-        <w:gridCol w:w="2914"/>
-        <w:gridCol w:w="2914"/>
+        <w:gridCol w:w="2428"/>
+        <w:gridCol w:w="2428"/>
+        <w:gridCol w:w="2428"/>
+        <w:gridCol w:w="2428"/>
+        <w:gridCol w:w="2428"/>
+        <w:gridCol w:w="2428"/>
       </w:tblGrid>
       <w:tr>
         <w:tc>
           <w:tcPr>
-            <w:tcW w:type="dxa" w:w="2914"/>
+            <w:tcW w:type="dxa" w:w="2428"/>
+          </w:tcPr>
+          <w:p>
+            <w:r/>
+            <w:r>
+              <w:rPr>
+                <w:b/>
+              </w:rPr>
+              <w:t>Buổi</w:t>
+            </w:r>
+          </w:p>
+        </w:tc>
+        <w:tc>
+          <w:tcPr>
+            <w:tcW w:type="dxa" w:w="2428"/>
+          </w:tcPr>
+          <w:p>
+            <w:r/>
+            <w:r>
+              <w:rPr>
+                <w:b/>
+              </w:rPr>
+              <w:t>Dùng ở</w:t>
+            </w:r>
+          </w:p>
+        </w:tc>
+        <w:tc>
+          <w:tcPr>
+            <w:tcW w:type="dxa" w:w="2428"/>
           </w:tcPr>
           <w:p>
             <w:r/>
@@ -44,21 +73,7 @@
         </w:tc>
         <w:tc>
           <w:tcPr>
-            <w:tcW w:type="dxa" w:w="2914"/>
-          </w:tcPr>
-          <w:p>
-            <w:r/>
-            <w:r>
-              <w:rPr>
-                <w:b/>
-              </w:rPr>
-              <w:t>Dùng ở</w:t>
-            </w:r>
-          </w:p>
-        </w:tc>
-        <w:tc>
-          <w:tcPr>
-            <w:tcW w:type="dxa" w:w="2914"/>
+            <w:tcW w:type="dxa" w:w="2428"/>
           </w:tcPr>
           <w:p>
             <w:r/>
@@ -72,7 +87,7 @@
         </w:tc>
         <w:tc>
           <w:tcPr>
-            <w:tcW w:type="dxa" w:w="2914"/>
+            <w:tcW w:type="dxa" w:w="2428"/>
           </w:tcPr>
           <w:p>
             <w:r/>
@@ -86,7 +101,7 @@
         </w:tc>
         <w:tc>
           <w:tcPr>
-            <w:tcW w:type="dxa" w:w="2914"/>
+            <w:tcW w:type="dxa" w:w="2428"/>
           </w:tcPr>
           <w:p>
             <w:r/>
@@ -102,37 +117,229 @@
       <w:tr>
         <w:tc>
           <w:tcPr>
-            <w:tcW w:type="dxa" w:w="2914"/>
+            <w:tcW w:type="dxa" w:w="2428"/>
           </w:tcPr>
           <w:p>
             <w:r>
-              <w:t>Hình 1.1. Tốc độ phản ứng thuận, nghịch theo thời gian</w:t>
+              <w:t>1</w:t>
             </w:r>
           </w:p>
         </w:tc>
         <w:tc>
           <w:tcPr>
-            <w:tcW w:type="dxa" w:w="2914"/>
+            <w:tcW w:type="dxa" w:w="2428"/>
           </w:tcPr>
           <w:p>
             <w:r>
-              <w:t>Buổi 1 / PX2</w:t>
+              <w:t>PX1</w:t>
             </w:r>
           </w:p>
         </w:tc>
         <w:tc>
           <w:tcPr>
-            <w:tcW w:type="dxa" w:w="2914"/>
+            <w:tcW w:type="dxa" w:w="2428"/>
           </w:tcPr>
           <w:p>
             <w:r>
-              <w:t>✓ Đã làm nét</w:t>
+              <w:t>Hang động có thạch nhũ (mở bài)</w:t>
             </w:r>
           </w:p>
         </w:tc>
         <w:tc>
           <w:tcPr>
-            <w:tcW w:type="dxa" w:w="2914"/>
+            <w:tcW w:type="dxa" w:w="2428"/>
+          </w:tcPr>
+          <w:p>
+            <w:r>
+              <w:t>✓ Đã duyệt</w:t>
+            </w:r>
+          </w:p>
+        </w:tc>
+        <w:tc>
+          <w:tcPr>
+            <w:tcW w:type="dxa" w:w="2428"/>
+          </w:tcPr>
+          <w:p>
+            <w:r>
+              <w:t>VOV, "New cave found in Vietnam's Phong Nha-Ke Bang reveals rare geological wonders"</w:t>
+            </w:r>
+          </w:p>
+        </w:tc>
+        <w:tc>
+          <w:tcPr>
+            <w:tcW w:type="dxa" w:w="2428"/>
+          </w:tcPr>
+          <w:p>
+            <w:r/>
+          </w:p>
+        </w:tc>
+      </w:tr>
+      <w:tr>
+        <w:tc>
+          <w:tcPr>
+            <w:tcW w:type="dxa" w:w="2428"/>
+          </w:tcPr>
+          <w:p>
+            <w:r>
+              <w:t>1</w:t>
+            </w:r>
+          </w:p>
+        </w:tc>
+        <w:tc>
+          <w:tcPr>
+            <w:tcW w:type="dxa" w:w="2428"/>
+          </w:tcPr>
+          <w:p>
+            <w:r>
+              <w:t>PX1</w:t>
+            </w:r>
+          </w:p>
+        </w:tc>
+        <w:tc>
+          <w:tcPr>
+            <w:tcW w:type="dxa" w:w="2428"/>
+          </w:tcPr>
+          <w:p>
+            <w:r>
+              <w:t>Thạch nhũ và măng đá, phản ứng thuận nghịch trong tự nhiên</w:t>
+            </w:r>
+          </w:p>
+        </w:tc>
+        <w:tc>
+          <w:tcPr>
+            <w:tcW w:type="dxa" w:w="2428"/>
+          </w:tcPr>
+          <w:p>
+            <w:r>
+              <w:t>✓ Đã duyệt</w:t>
+            </w:r>
+          </w:p>
+        </w:tc>
+        <w:tc>
+          <w:tcPr>
+            <w:tcW w:type="dxa" w:w="2428"/>
+          </w:tcPr>
+          <w:p>
+            <w:r>
+              <w:t>Voarintsoa, N. R. G., ResearchGate, Figure 7 (Việt hóa)</w:t>
+            </w:r>
+          </w:p>
+        </w:tc>
+        <w:tc>
+          <w:tcPr>
+            <w:tcW w:type="dxa" w:w="2428"/>
+          </w:tcPr>
+          <w:p>
+            <w:r/>
+          </w:p>
+        </w:tc>
+      </w:tr>
+      <w:tr>
+        <w:tc>
+          <w:tcPr>
+            <w:tcW w:type="dxa" w:w="2428"/>
+          </w:tcPr>
+          <w:p>
+            <w:r>
+              <w:t>1</w:t>
+            </w:r>
+          </w:p>
+        </w:tc>
+        <w:tc>
+          <w:tcPr>
+            <w:tcW w:type="dxa" w:w="2428"/>
+          </w:tcPr>
+          <w:p>
+            <w:r>
+              <w:t>PX1</w:t>
+            </w:r>
+          </w:p>
+        </w:tc>
+        <w:tc>
+          <w:tcPr>
+            <w:tcW w:type="dxa" w:w="2428"/>
+          </w:tcPr>
+          <w:p>
+            <w:r>
+              <w:t>Đồ thị nồng độ đi tới cân bằng từ hai phía</w:t>
+            </w:r>
+          </w:p>
+        </w:tc>
+        <w:tc>
+          <w:tcPr>
+            <w:tcW w:type="dxa" w:w="2428"/>
+          </w:tcPr>
+          <w:p>
+            <w:r>
+              <w:t>✓ Đã duyệt</w:t>
+            </w:r>
+          </w:p>
+        </w:tc>
+        <w:tc>
+          <w:tcPr>
+            <w:tcW w:type="dxa" w:w="2428"/>
+          </w:tcPr>
+          <w:p>
+            <w:r>
+              <w:t>P20 STUDY vẽ theo số liệu PX1; tham khảo SCH 4U Unit 5 Chemical Equilibrium</w:t>
+            </w:r>
+          </w:p>
+        </w:tc>
+        <w:tc>
+          <w:tcPr>
+            <w:tcW w:type="dxa" w:w="2428"/>
+          </w:tcPr>
+          <w:p>
+            <w:r>
+              <w:t>Chỉ dùng trong bài giảng, không đặt trong đề PX1</w:t>
+            </w:r>
+          </w:p>
+        </w:tc>
+      </w:tr>
+      <w:tr>
+        <w:tc>
+          <w:tcPr>
+            <w:tcW w:type="dxa" w:w="2428"/>
+          </w:tcPr>
+          <w:p>
+            <w:r>
+              <w:t>1</w:t>
+            </w:r>
+          </w:p>
+        </w:tc>
+        <w:tc>
+          <w:tcPr>
+            <w:tcW w:type="dxa" w:w="2428"/>
+          </w:tcPr>
+          <w:p>
+            <w:r>
+              <w:t>PX2</w:t>
+            </w:r>
+          </w:p>
+        </w:tc>
+        <w:tc>
+          <w:tcPr>
+            <w:tcW w:type="dxa" w:w="2428"/>
+          </w:tcPr>
+          <w:p>
+            <w:r>
+              <w:t>Tốc độ phản ứng thuận và nghịch theo thời gian</w:t>
+            </w:r>
+          </w:p>
+        </w:tc>
+        <w:tc>
+          <w:tcPr>
+            <w:tcW w:type="dxa" w:w="2428"/>
+          </w:tcPr>
+          <w:p>
+            <w:r>
+              <w:t>✓ Đã duyệt</w:t>
+            </w:r>
+          </w:p>
+        </w:tc>
+        <w:tc>
+          <w:tcPr>
+            <w:tcW w:type="dxa" w:w="2428"/>
           </w:tcPr>
           <w:p>
             <w:r>
@@ -142,7 +349,7 @@
         </w:tc>
         <w:tc>
           <w:tcPr>
-            <w:tcW w:type="dxa" w:w="2914"/>
+            <w:tcW w:type="dxa" w:w="2428"/>
           </w:tcPr>
           <w:p>
             <w:r/>
@@ -152,51 +359,61 @@
       <w:tr>
         <w:tc>
           <w:tcPr>
-            <w:tcW w:type="dxa" w:w="2914"/>
+            <w:tcW w:type="dxa" w:w="2428"/>
           </w:tcPr>
           <w:p>
             <w:r>
-              <w:t>Đồ thị nồng độ đi tới cân bằng từ hai phía</w:t>
+              <w:t>1</w:t>
             </w:r>
           </w:p>
         </w:tc>
         <w:tc>
           <w:tcPr>
-            <w:tcW w:type="dxa" w:w="2914"/>
+            <w:tcW w:type="dxa" w:w="2428"/>
           </w:tcPr>
           <w:p>
             <w:r>
-              <w:t>Buổi 1 / bài giảng PX1–PX2</w:t>
+              <w:t>PX2</w:t>
             </w:r>
           </w:p>
         </w:tc>
         <w:tc>
           <w:tcPr>
-            <w:tcW w:type="dxa" w:w="2914"/>
+            <w:tcW w:type="dxa" w:w="2428"/>
           </w:tcPr>
           <w:p>
             <w:r>
-              <w:t>✓ Vẽ bằng matplotlib theo số liệu PX1 (Kc = 64)</w:t>
+              <w:t>Cân bằng động (vòi nước) và cân bằng tĩnh (bập bênh)</w:t>
             </w:r>
           </w:p>
         </w:tc>
         <w:tc>
           <w:tcPr>
-            <w:tcW w:type="dxa" w:w="2914"/>
+            <w:tcW w:type="dxa" w:w="2428"/>
           </w:tcPr>
           <w:p>
             <w:r>
-              <w:t>P20 STUDY vẽ; tham khảo SCH 4U Strand 3, Unit 5 Chemical Equilibrium</w:t>
+              <w:t>✓ Đã duyệt</w:t>
             </w:r>
           </w:p>
         </w:tc>
         <w:tc>
           <w:tcPr>
-            <w:tcW w:type="dxa" w:w="2914"/>
+            <w:tcW w:type="dxa" w:w="2428"/>
           </w:tcPr>
           <w:p>
             <w:r>
-              <w:t>Chỉ dùng trong bài giảng, không đặt trong PX1 (lộ đáp án ý 4)</w:t>
+              <w:t>Vẽ lại theo mẫu: "Equilibria (IB or A level chemistry)", Lmbroomfield, tes.com</w:t>
+            </w:r>
+          </w:p>
+        </w:tc>
+        <w:tc>
+          <w:tcPr>
+            <w:tcW w:type="dxa" w:w="2428"/>
+          </w:tcPr>
+          <w:p>
+            <w:r>
+              <w:t>Chốt ý sau hình tốc độ</w:t>
             </w:r>
           </w:p>
         </w:tc>
@@ -204,141 +421,287 @@
       <w:tr>
         <w:tc>
           <w:tcPr>
-            <w:tcW w:type="dxa" w:w="2914"/>
+            <w:tcW w:type="dxa" w:w="2428"/>
           </w:tcPr>
           <w:p>
             <w:r>
-              <w:t>Thạch nhũ và măng đá</w:t>
+              <w:t>1</w:t>
             </w:r>
           </w:p>
         </w:tc>
         <w:tc>
           <w:tcPr>
-            <w:tcW w:type="dxa" w:w="2914"/>
+            <w:tcW w:type="dxa" w:w="2428"/>
           </w:tcPr>
           <w:p>
             <w:r>
-              <w:t>Buổi 1 / PX1</w:t>
+              <w:t>PX3</w:t>
             </w:r>
           </w:p>
         </w:tc>
         <w:tc>
           <w:tcPr>
-            <w:tcW w:type="dxa" w:w="2914"/>
+            <w:tcW w:type="dxa" w:w="2428"/>
           </w:tcPr>
           <w:p>
             <w:r>
-              <w:t>✓ Đã Việt hóa, làm nét</w:t>
+              <w:t>Lò nung vôi: quạt hút CO₂ để CaCO₃ phân hủy gần hết</w:t>
             </w:r>
           </w:p>
         </w:tc>
         <w:tc>
           <w:tcPr>
-            <w:tcW w:type="dxa" w:w="2914"/>
+            <w:tcW w:type="dxa" w:w="2428"/>
           </w:tcPr>
           <w:p>
             <w:r>
-              <w:t>Voarintsoa, N. R. G., ResearchGate, Figure 7 (Việt hóa)</w:t>
+              <w:t>Chờ</w:t>
             </w:r>
           </w:p>
         </w:tc>
         <w:tc>
           <w:tcPr>
-            <w:tcW w:type="dxa" w:w="2914"/>
+            <w:tcW w:type="dxa" w:w="2428"/>
           </w:tcPr>
           <w:p>
             <w:r>
-              <w:t>Cắt tay phần chú thích tiếng Anh dưới hình trước khi gửi Gemini</w:t>
+              <w:t>Wikipedia, "Lime kiln" (Việt hóa)</w:t>
             </w:r>
+          </w:p>
+        </w:tc>
+        <w:tc>
+          <w:tcPr>
+            <w:tcW w:type="dxa" w:w="2428"/>
+          </w:tcPr>
+          <w:p>
+            <w:r/>
           </w:p>
         </w:tc>
       </w:tr>
       <w:tr>
         <w:tc>
           <w:tcPr>
-            <w:tcW w:type="dxa" w:w="2914"/>
+            <w:tcW w:type="dxa" w:w="2428"/>
           </w:tcPr>
           <w:p>
             <w:r>
-              <w:t>Vòi nước (cân bằng động) và bập bênh (cân bằng tĩnh)</w:t>
+              <w:t>1</w:t>
             </w:r>
           </w:p>
         </w:tc>
         <w:tc>
           <w:tcPr>
-            <w:tcW w:type="dxa" w:w="2914"/>
+            <w:tcW w:type="dxa" w:w="2428"/>
           </w:tcPr>
           <w:p>
             <w:r>
-              <w:t>Buổi 1 / PX2</w:t>
+              <w:t>PX5</w:t>
             </w:r>
           </w:p>
         </w:tc>
         <w:tc>
           <w:tcPr>
-            <w:tcW w:type="dxa" w:w="2914"/>
+            <w:tcW w:type="dxa" w:w="2428"/>
           </w:tcPr>
           <w:p>
             <w:r>
-              <w:t>✓ Đã vẽ lại theo mẫu</w:t>
+              <w:t>Nổ bóng H₂: Kc rất lớn nhưng cần tia lửa</w:t>
             </w:r>
           </w:p>
         </w:tc>
         <w:tc>
           <w:tcPr>
-            <w:tcW w:type="dxa" w:w="2914"/>
+            <w:tcW w:type="dxa" w:w="2428"/>
           </w:tcPr>
           <w:p>
             <w:r>
-              <w:t>Vẽ lại theo mẫu: "Equilibria (IB or A level chemistry)", Lmbroomfield, tes.com; bập bênh: world-builders.org</w:t>
+              <w:t>✓ Đã duyệt</w:t>
             </w:r>
           </w:p>
         </w:tc>
         <w:tc>
           <w:tcPr>
-            <w:tcW w:type="dxa" w:w="2914"/>
+            <w:tcW w:type="dxa" w:w="2428"/>
           </w:tcPr>
           <w:p>
             <w:r>
-              <w:t>Tài liệu gốc trả phí, chỉ dùng làm mẫu bố cục</w:t>
+              <w:t>ThoughtCo, "Hydrogen Balloon Explosion"</w:t>
             </w:r>
+          </w:p>
+        </w:tc>
+        <w:tc>
+          <w:tcPr>
+            <w:tcW w:type="dxa" w:w="2428"/>
+          </w:tcPr>
+          <w:p>
+            <w:r/>
           </w:p>
         </w:tc>
       </w:tr>
       <w:tr>
         <w:tc>
           <w:tcPr>
-            <w:tcW w:type="dxa" w:w="2914"/>
+            <w:tcW w:type="dxa" w:w="2428"/>
           </w:tcPr>
           <w:p>
             <w:r>
-              <w:t>Hình 1.2. Nhiệt độ và cân bằng 2NO₂ ⇌ N₂O₄</w:t>
+              <w:t>1</w:t>
             </w:r>
           </w:p>
         </w:tc>
         <w:tc>
           <w:tcPr>
-            <w:tcW w:type="dxa" w:w="2914"/>
+            <w:tcW w:type="dxa" w:w="2428"/>
           </w:tcPr>
           <w:p>
             <w:r>
-              <w:t>Buổi 2 / PX9</w:t>
+              <w:t>PX5</w:t>
             </w:r>
           </w:p>
         </w:tc>
         <w:tc>
           <w:tcPr>
-            <w:tcW w:type="dxa" w:w="2914"/>
+            <w:tcW w:type="dxa" w:w="2428"/>
           </w:tcPr>
           <w:p>
             <w:r>
-              <w:t>✓ Đã làm nét</w:t>
+              <w:t>Bộ xúc tác trên đường ống xả ô tô</w:t>
             </w:r>
           </w:p>
         </w:tc>
         <w:tc>
           <w:tcPr>
-            <w:tcW w:type="dxa" w:w="2914"/>
+            <w:tcW w:type="dxa" w:w="2428"/>
+          </w:tcPr>
+          <w:p>
+            <w:r>
+              <w:t>✓ Đã duyệt</w:t>
+            </w:r>
+          </w:p>
+        </w:tc>
+        <w:tc>
+          <w:tcPr>
+            <w:tcW w:type="dxa" w:w="2428"/>
+          </w:tcPr>
+          <w:p>
+            <w:r>
+              <w:t>DLR elib (Việt hóa)</w:t>
+            </w:r>
+          </w:p>
+        </w:tc>
+        <w:tc>
+          <w:tcPr>
+            <w:tcW w:type="dxa" w:w="2428"/>
+          </w:tcPr>
+          <w:p>
+            <w:r/>
+          </w:p>
+        </w:tc>
+      </w:tr>
+      <w:tr>
+        <w:tc>
+          <w:tcPr>
+            <w:tcW w:type="dxa" w:w="2428"/>
+          </w:tcPr>
+          <w:p>
+            <w:r>
+              <w:t>1</w:t>
+            </w:r>
+          </w:p>
+        </w:tc>
+        <w:tc>
+          <w:tcPr>
+            <w:tcW w:type="dxa" w:w="2428"/>
+          </w:tcPr>
+          <w:p>
+            <w:r>
+              <w:t>PX6</w:t>
+            </w:r>
+          </w:p>
+        </w:tc>
+        <w:tc>
+          <w:tcPr>
+            <w:tcW w:type="dxa" w:w="2428"/>
+          </w:tcPr>
+          <w:p>
+            <w:r>
+              <w:t>So sánh Q với K quyết định chiều phản ứng</w:t>
+            </w:r>
+          </w:p>
+        </w:tc>
+        <w:tc>
+          <w:tcPr>
+            <w:tcW w:type="dxa" w:w="2428"/>
+          </w:tcPr>
+          <w:p>
+            <w:r>
+              <w:t>✓ Đã duyệt</w:t>
+            </w:r>
+          </w:p>
+        </w:tc>
+        <w:tc>
+          <w:tcPr>
+            <w:tcW w:type="dxa" w:w="2428"/>
+          </w:tcPr>
+          <w:p>
+            <w:r>
+              <w:t>Chemistry Steps, "Reaction Quotient – Q" (Việt hóa)</w:t>
+            </w:r>
+          </w:p>
+        </w:tc>
+        <w:tc>
+          <w:tcPr>
+            <w:tcW w:type="dxa" w:w="2428"/>
+          </w:tcPr>
+          <w:p>
+            <w:r/>
+          </w:p>
+        </w:tc>
+      </w:tr>
+      <w:tr>
+        <w:tc>
+          <w:tcPr>
+            <w:tcW w:type="dxa" w:w="2428"/>
+          </w:tcPr>
+          <w:p>
+            <w:r>
+              <w:t>2</w:t>
+            </w:r>
+          </w:p>
+        </w:tc>
+        <w:tc>
+          <w:tcPr>
+            <w:tcW w:type="dxa" w:w="2428"/>
+          </w:tcPr>
+          <w:p>
+            <w:r>
+              <w:t>PX7</w:t>
+            </w:r>
+          </w:p>
+        </w:tc>
+        <w:tc>
+          <w:tcPr>
+            <w:tcW w:type="dxa" w:w="2428"/>
+          </w:tcPr>
+          <w:p>
+            <w:r>
+              <w:t>Nồng độ và cân bằng thủy phân CH₃COONa</w:t>
+            </w:r>
+          </w:p>
+        </w:tc>
+        <w:tc>
+          <w:tcPr>
+            <w:tcW w:type="dxa" w:w="2428"/>
+          </w:tcPr>
+          <w:p>
+            <w:r>
+              <w:t>✓ Đã duyệt</w:t>
+            </w:r>
+          </w:p>
+        </w:tc>
+        <w:tc>
+          <w:tcPr>
+            <w:tcW w:type="dxa" w:w="2428"/>
           </w:tcPr>
           <w:p>
             <w:r>
@@ -348,49 +711,57 @@
         </w:tc>
         <w:tc>
           <w:tcPr>
-            <w:tcW w:type="dxa" w:w="2914"/>
+            <w:tcW w:type="dxa" w:w="2428"/>
           </w:tcPr>
           <w:p>
-            <w:r>
-              <w:t>Nền tím xám, lệch tông với 1.3, 1.4</w:t>
-            </w:r>
+            <w:r/>
           </w:p>
         </w:tc>
       </w:tr>
       <w:tr>
         <w:tc>
           <w:tcPr>
-            <w:tcW w:type="dxa" w:w="2914"/>
+            <w:tcW w:type="dxa" w:w="2428"/>
           </w:tcPr>
           <w:p>
             <w:r>
-              <w:t>Hình 1.3. Nhiệt độ và cân bằng thủy phân CH₃COONa</w:t>
+              <w:t>2</w:t>
             </w:r>
           </w:p>
         </w:tc>
         <w:tc>
           <w:tcPr>
-            <w:tcW w:type="dxa" w:w="2914"/>
+            <w:tcW w:type="dxa" w:w="2428"/>
           </w:tcPr>
           <w:p>
             <w:r>
-              <w:t>Buổi 2 / PX9</w:t>
+              <w:t>PX8</w:t>
             </w:r>
           </w:p>
         </w:tc>
         <w:tc>
           <w:tcPr>
-            <w:tcW w:type="dxa" w:w="2914"/>
+            <w:tcW w:type="dxa" w:w="2428"/>
           </w:tcPr>
           <w:p>
             <w:r>
-              <w:t>✓ Đã làm nét</w:t>
+              <w:t>Áp suất và cân bằng NO₂ trong xi-lanh</w:t>
             </w:r>
           </w:p>
         </w:tc>
         <w:tc>
           <w:tcPr>
-            <w:tcW w:type="dxa" w:w="2914"/>
+            <w:tcW w:type="dxa" w:w="2428"/>
+          </w:tcPr>
+          <w:p>
+            <w:r>
+              <w:t>✓ Đã duyệt</w:t>
+            </w:r>
+          </w:p>
+        </w:tc>
+        <w:tc>
+          <w:tcPr>
+            <w:tcW w:type="dxa" w:w="2428"/>
           </w:tcPr>
           <w:p>
             <w:r>
@@ -400,11 +771,11 @@
         </w:tc>
         <w:tc>
           <w:tcPr>
-            <w:tcW w:type="dxa" w:w="2914"/>
+            <w:tcW w:type="dxa" w:w="2428"/>
           </w:tcPr>
           <w:p>
             <w:r>
-              <w:t>Ống (2) gần cùng màu ống (1); nói rõ khi giảng</w:t>
+              <w:t>Sau khi nén, màu nhạt bớt nhưng vẫn đậm hơn lúc chưa nén</w:t>
             </w:r>
           </w:p>
         </w:tc>
@@ -412,37 +783,47 @@
       <w:tr>
         <w:tc>
           <w:tcPr>
-            <w:tcW w:type="dxa" w:w="2914"/>
+            <w:tcW w:type="dxa" w:w="2428"/>
           </w:tcPr>
           <w:p>
             <w:r>
-              <w:t>Hình 1.4. Nồng độ và cân bằng thủy phân CH₃COONa</w:t>
+              <w:t>2</w:t>
             </w:r>
           </w:p>
         </w:tc>
         <w:tc>
           <w:tcPr>
-            <w:tcW w:type="dxa" w:w="2914"/>
+            <w:tcW w:type="dxa" w:w="2428"/>
           </w:tcPr>
           <w:p>
             <w:r>
-              <w:t>Buổi 2 / PX7</w:t>
+              <w:t>PX9</w:t>
             </w:r>
           </w:p>
         </w:tc>
         <w:tc>
           <w:tcPr>
-            <w:tcW w:type="dxa" w:w="2914"/>
+            <w:tcW w:type="dxa" w:w="2428"/>
           </w:tcPr>
           <w:p>
             <w:r>
-              <w:t>✓ Đã làm nét</w:t>
+              <w:t>Nhiệt độ và cân bằng 2NO₂ ⇌ N₂O₄</w:t>
             </w:r>
           </w:p>
         </w:tc>
         <w:tc>
           <w:tcPr>
-            <w:tcW w:type="dxa" w:w="2914"/>
+            <w:tcW w:type="dxa" w:w="2428"/>
+          </w:tcPr>
+          <w:p>
+            <w:r>
+              <w:t>✓ Đã duyệt</w:t>
+            </w:r>
+          </w:p>
+        </w:tc>
+        <w:tc>
+          <w:tcPr>
+            <w:tcW w:type="dxa" w:w="2428"/>
           </w:tcPr>
           <w:p>
             <w:r>
@@ -452,47 +833,59 @@
         </w:tc>
         <w:tc>
           <w:tcPr>
-            <w:tcW w:type="dxa" w:w="2914"/>
+            <w:tcW w:type="dxa" w:w="2428"/>
           </w:tcPr>
           <w:p>
-            <w:r/>
+            <w:r>
+              <w:t>Dạy cặp với hình tiếp theo</w:t>
+            </w:r>
           </w:p>
         </w:tc>
       </w:tr>
       <w:tr>
         <w:tc>
           <w:tcPr>
-            <w:tcW w:type="dxa" w:w="2914"/>
+            <w:tcW w:type="dxa" w:w="2428"/>
           </w:tcPr>
           <w:p>
             <w:r>
-              <w:t>Hình 1.5. Áp suất và cân bằng NO₂ trong xi-lanh</w:t>
+              <w:t>2</w:t>
             </w:r>
           </w:p>
         </w:tc>
         <w:tc>
           <w:tcPr>
-            <w:tcW w:type="dxa" w:w="2914"/>
+            <w:tcW w:type="dxa" w:w="2428"/>
           </w:tcPr>
           <w:p>
             <w:r>
-              <w:t>Buổi 2 / PX8</w:t>
+              <w:t>PX9</w:t>
             </w:r>
           </w:p>
         </w:tc>
         <w:tc>
           <w:tcPr>
-            <w:tcW w:type="dxa" w:w="2914"/>
+            <w:tcW w:type="dxa" w:w="2428"/>
           </w:tcPr>
           <w:p>
             <w:r>
-              <w:t>✓ Đã làm nét</w:t>
+              <w:t>Nhiệt độ và cân bằng thủy phân CH₃COONa</w:t>
             </w:r>
           </w:p>
         </w:tc>
         <w:tc>
           <w:tcPr>
-            <w:tcW w:type="dxa" w:w="2914"/>
+            <w:tcW w:type="dxa" w:w="2428"/>
+          </w:tcPr>
+          <w:p>
+            <w:r>
+              <w:t>✓ Đã duyệt</w:t>
+            </w:r>
+          </w:p>
+        </w:tc>
+        <w:tc>
+          <w:tcPr>
+            <w:tcW w:type="dxa" w:w="2428"/>
           </w:tcPr>
           <w:p>
             <w:r>
@@ -502,11 +895,11 @@
         </w:tc>
         <w:tc>
           <w:tcPr>
-            <w:tcW w:type="dxa" w:w="2914"/>
+            <w:tcW w:type="dxa" w:w="2428"/>
           </w:tcPr>
           <w:p>
             <w:r>
-              <w:t>Ghi chú dưới hình: sau khi nén, màu nhạt bớt nhưng vẫn đậm hơn lúc chưa nén</w:t>
+              <w:t>Ống (2) gần cùng màu ống (1), nói rõ khi giảng</w:t>
             </w:r>
           </w:p>
         </w:tc>
@@ -514,7 +907,27 @@
       <w:tr>
         <w:tc>
           <w:tcPr>
-            <w:tcW w:type="dxa" w:w="2914"/>
+            <w:tcW w:type="dxa" w:w="2428"/>
+          </w:tcPr>
+          <w:p>
+            <w:r>
+              <w:t>3</w:t>
+            </w:r>
+          </w:p>
+        </w:tc>
+        <w:tc>
+          <w:tcPr>
+            <w:tcW w:type="dxa" w:w="2428"/>
+          </w:tcPr>
+          <w:p>
+            <w:r>
+              <w:t>Đề 2</w:t>
+            </w:r>
+          </w:p>
+        </w:tc>
+        <w:tc>
+          <w:tcPr>
+            <w:tcW w:type="dxa" w:w="2428"/>
           </w:tcPr>
           <w:p>
             <w:r>
@@ -524,27 +937,17 @@
         </w:tc>
         <w:tc>
           <w:tcPr>
-            <w:tcW w:type="dxa" w:w="2914"/>
+            <w:tcW w:type="dxa" w:w="2428"/>
           </w:tcPr>
           <w:p>
             <w:r>
-              <w:t>Buổi 3 / Đề 2</w:t>
+              <w:t>Chờ</w:t>
             </w:r>
           </w:p>
         </w:tc>
         <w:tc>
           <w:tcPr>
-            <w:tcW w:type="dxa" w:w="2914"/>
-          </w:tcPr>
-          <w:p>
-            <w:r>
-              <w:t>Chờ Gemini vẽ lại theo mẫu</w:t>
-            </w:r>
-          </w:p>
-        </w:tc>
-        <w:tc>
-          <w:tcPr>
-            <w:tcW w:type="dxa" w:w="2914"/>
+            <w:tcW w:type="dxa" w:w="2428"/>
           </w:tcPr>
           <w:p>
             <w:r>
@@ -554,7 +957,7 @@
         </w:tc>
         <w:tc>
           <w:tcPr>
-            <w:tcW w:type="dxa" w:w="2914"/>
+            <w:tcW w:type="dxa" w:w="2428"/>
           </w:tcPr>
           <w:p>
             <w:r>
@@ -564,19 +967,12 @@
         </w:tc>
       </w:tr>
     </w:tbl>
-    <w:p/>
     <w:p>
-      <w:r>
-        <w:rPr>
-          <w:b/>
-        </w:rPr>
-        <w:t xml:space="preserve">Cách ghi nguồn dưới hình: </w:t>
-      </w:r>
       <w:r>
         <w:rPr>
           <w:i/>
         </w:rPr>
-        <w:t>Nguồn: SGK Hóa học 11, KNTT. Ảnh nước ngoài ghi tác giả hoặc trang gốc, kèm "Việt hóa" hoặc "vẽ lại theo mẫu".</w:t>
+        <w:t>Cách ghi nguồn dưới hình: "Nguồn: SGK Hóa học 11, KNTT". Ảnh nước ngoài ghi tác giả hoặc trang gốc, kèm "Việt hóa" hoặc "vẽ lại theo mẫu".</w:t>
       </w:r>
     </w:p>
     <w:sectPr>

</xml_diff>

<commit_message>
Buổi 1: PDF LaTeX gửi HS (PX1–PX6, có khoảng trống viết) + zip Overleaf; mỗi ảnh chỉ ghi 1 nguồn
Co-Authored-By: Claude Opus 5.5 <noreply@anthropic.com>
Claude-Session: https://claude.ai/code/session_01YToDWK6Q41xkdnJbBz9Sbt
</commit_message>
<xml_diff>
--- a/Can bang hoa hoc/Danh sách ảnh và nguồn.docx
+++ b/Can bang hoa hoc/Danh sách ảnh và nguồn.docx
@@ -281,7 +281,7 @@
           </w:tcPr>
           <w:p>
             <w:r>
-              <w:t>P20 STUDY vẽ theo số liệu PX1; tham khảo SCH 4U Unit 5 Chemical Equilibrium</w:t>
+              <w:t>tham khảo SCH 4U, Unit 5 Chemical Equilibrium</w:t>
             </w:r>
           </w:p>
         </w:tc>
@@ -291,7 +291,7 @@
           </w:tcPr>
           <w:p>
             <w:r>
-              <w:t>Chỉ dùng trong bài giảng, không đặt trong đề PX1</w:t>
+              <w:t>Vẽ theo số liệu PX1. Chỉ dùng trong bài giảng, không đặt trong đề PX1</w:t>
             </w:r>
           </w:p>
         </w:tc>
@@ -403,7 +403,7 @@
           </w:tcPr>
           <w:p>
             <w:r>
-              <w:t>Vẽ lại theo mẫu: "Equilibria (IB or A level chemistry)", Lmbroomfield, tes.com</w:t>
+              <w:t>tham khảo Lmbroomfield, "Equilibria (IB or A level chemistry)", tes.com</w:t>
             </w:r>
           </w:p>
         </w:tc>
@@ -951,7 +951,7 @@
           </w:tcPr>
           <w:p>
             <w:r>
-              <w:t>Vẽ lại theo mẫu: "Equilibria (IB or A level chemistry)", Lmbroomfield, tes.com</w:t>
+              <w:t>tham khảo Lmbroomfield, "Equilibria (IB or A level chemistry)", tes.com</w:t>
             </w:r>
           </w:p>
         </w:tc>
@@ -972,7 +972,7 @@
         <w:rPr>
           <w:i/>
         </w:rPr>
-        <w:t>Cách ghi nguồn dưới hình: "Nguồn: SGK Hóa học 11, KNTT". Ảnh nước ngoài ghi tác giả hoặc trang gốc, kèm "Việt hóa" hoặc "vẽ lại theo mẫu".</w:t>
+        <w:t>Cách ghi nguồn dưới hình: "Nguồn: SGK Hóa học 11, KNTT". Ảnh nước ngoài ghi tác giả hoặc trang gốc, kèm "Việt hóa" hoặc ghi "tham khảo ...". Mỗi ảnh chỉ ghi 1 nguồn.</w:t>
       </w:r>
     </w:p>
     <w:sectPr>

</xml_diff>

<commit_message>
Buổi 1: dựng lại theo khung chuyên đề Sóng (lý thuyết, VD, phản xạ, bẫy, ngữ liệu lạ), bản HS + SOURCE + PDF; soát giọng AI, rút gọn tên PX
Co-Authored-By: Claude Opus 5.5 <noreply@anthropic.com>
Claude-Session: https://claude.ai/code/session_01YToDWK6Q41xkdnJbBz9Sbt
</commit_message>
<xml_diff>
--- a/Can bang hoa hoc/Danh sách ảnh và nguồn.docx
+++ b/Can bang hoa hoc/Danh sách ảnh và nguồn.docx
@@ -231,68 +231,6 @@
           </w:tcPr>
           <w:p>
             <w:r/>
-          </w:p>
-        </w:tc>
-      </w:tr>
-      <w:tr>
-        <w:tc>
-          <w:tcPr>
-            <w:tcW w:type="dxa" w:w="2428"/>
-          </w:tcPr>
-          <w:p>
-            <w:r>
-              <w:t>1</w:t>
-            </w:r>
-          </w:p>
-        </w:tc>
-        <w:tc>
-          <w:tcPr>
-            <w:tcW w:type="dxa" w:w="2428"/>
-          </w:tcPr>
-          <w:p>
-            <w:r>
-              <w:t>PX1</w:t>
-            </w:r>
-          </w:p>
-        </w:tc>
-        <w:tc>
-          <w:tcPr>
-            <w:tcW w:type="dxa" w:w="2428"/>
-          </w:tcPr>
-          <w:p>
-            <w:r>
-              <w:t>Đồ thị nồng độ đi tới cân bằng từ hai phía</w:t>
-            </w:r>
-          </w:p>
-        </w:tc>
-        <w:tc>
-          <w:tcPr>
-            <w:tcW w:type="dxa" w:w="2428"/>
-          </w:tcPr>
-          <w:p>
-            <w:r>
-              <w:t>✓ Đã duyệt</w:t>
-            </w:r>
-          </w:p>
-        </w:tc>
-        <w:tc>
-          <w:tcPr>
-            <w:tcW w:type="dxa" w:w="2428"/>
-          </w:tcPr>
-          <w:p>
-            <w:r>
-              <w:t>tham khảo SCH 4U, Unit 5 Chemical Equilibrium</w:t>
-            </w:r>
-          </w:p>
-        </w:tc>
-        <w:tc>
-          <w:tcPr>
-            <w:tcW w:type="dxa" w:w="2428"/>
-          </w:tcPr>
-          <w:p>
-            <w:r>
-              <w:t>Vẽ theo số liệu PX1. Chỉ dùng trong bài giảng, không đặt trong đề PX1</w:t>
-            </w:r>
           </w:p>
         </w:tc>
       </w:tr>
@@ -655,6 +593,68 @@
           </w:tcPr>
           <w:p>
             <w:r/>
+          </w:p>
+        </w:tc>
+      </w:tr>
+      <w:tr>
+        <w:tc>
+          <w:tcPr>
+            <w:tcW w:type="dxa" w:w="2428"/>
+          </w:tcPr>
+          <w:p>
+            <w:r>
+              <w:t>1</w:t>
+            </w:r>
+          </w:p>
+        </w:tc>
+        <w:tc>
+          <w:tcPr>
+            <w:tcW w:type="dxa" w:w="2428"/>
+          </w:tcPr>
+          <w:p>
+            <w:r>
+              <w:t>PX1</w:t>
+            </w:r>
+          </w:p>
+        </w:tc>
+        <w:tc>
+          <w:tcPr>
+            <w:tcW w:type="dxa" w:w="2428"/>
+          </w:tcPr>
+          <w:p>
+            <w:r>
+              <w:t>Đồ thị nồng độ đi tới cân bằng từ hai phía</w:t>
+            </w:r>
+          </w:p>
+        </w:tc>
+        <w:tc>
+          <w:tcPr>
+            <w:tcW w:type="dxa" w:w="2428"/>
+          </w:tcPr>
+          <w:p>
+            <w:r>
+              <w:t>✓ Đã duyệt</w:t>
+            </w:r>
+          </w:p>
+        </w:tc>
+        <w:tc>
+          <w:tcPr>
+            <w:tcW w:type="dxa" w:w="2428"/>
+          </w:tcPr>
+          <w:p>
+            <w:r>
+              <w:t>tham khảo SCH 4U, Unit 5 Chemical Equilibrium</w:t>
+            </w:r>
+          </w:p>
+        </w:tc>
+        <w:tc>
+          <w:tcPr>
+            <w:tcW w:type="dxa" w:w="2428"/>
+          </w:tcPr>
+          <w:p>
+            <w:r>
+              <w:t>Vẽ theo số liệu PX1. Chỉ có trong bản GV (đáp án PX1 ý 4), không đưa vào bản HS vì lộ đáp án</w:t>
+            </w:r>
           </w:p>
         </w:tc>
       </w:tr>

</xml_diff>

<commit_message>
Buổi 1: đưa đồ thị nồng độ vào bài giảng HS (PX2, sau câu hỏi PX1), bản HS có đủ 9 hình
Co-Authored-By: Claude Opus 5.5 <noreply@anthropic.com>
Claude-Session: https://claude.ai/code/session_01YToDWK6Q41xkdnJbBz9Sbt
</commit_message>
<xml_diff>
--- a/Can bang hoa hoc/Danh sách ảnh và nguồn.docx
+++ b/Can bang hoa hoc/Danh sách ảnh và nguồn.docx
@@ -373,6 +373,68 @@
           </w:tcPr>
           <w:p>
             <w:r>
+              <w:t>PX2</w:t>
+            </w:r>
+          </w:p>
+        </w:tc>
+        <w:tc>
+          <w:tcPr>
+            <w:tcW w:type="dxa" w:w="2428"/>
+          </w:tcPr>
+          <w:p>
+            <w:r>
+              <w:t>Đồ thị nồng độ đi tới cân bằng từ hai phía</w:t>
+            </w:r>
+          </w:p>
+        </w:tc>
+        <w:tc>
+          <w:tcPr>
+            <w:tcW w:type="dxa" w:w="2428"/>
+          </w:tcPr>
+          <w:p>
+            <w:r>
+              <w:t>✓ Đã duyệt</w:t>
+            </w:r>
+          </w:p>
+        </w:tc>
+        <w:tc>
+          <w:tcPr>
+            <w:tcW w:type="dxa" w:w="2428"/>
+          </w:tcPr>
+          <w:p>
+            <w:r>
+              <w:t>tham khảo SCH 4U, Unit 5 Chemical Equilibrium</w:t>
+            </w:r>
+          </w:p>
+        </w:tc>
+        <w:tc>
+          <w:tcPr>
+            <w:tcW w:type="dxa" w:w="2428"/>
+          </w:tcPr>
+          <w:p>
+            <w:r>
+              <w:t>Vẽ theo số liệu PX1. Đặt ở PX2 (sau câu hỏi PX1) để không lộ ngay đáp án PX1 ý 4</w:t>
+            </w:r>
+          </w:p>
+        </w:tc>
+      </w:tr>
+      <w:tr>
+        <w:tc>
+          <w:tcPr>
+            <w:tcW w:type="dxa" w:w="2428"/>
+          </w:tcPr>
+          <w:p>
+            <w:r>
+              <w:t>1</w:t>
+            </w:r>
+          </w:p>
+        </w:tc>
+        <w:tc>
+          <w:tcPr>
+            <w:tcW w:type="dxa" w:w="2428"/>
+          </w:tcPr>
+          <w:p>
+            <w:r>
               <w:t>PX3</w:t>
             </w:r>
           </w:p>
@@ -593,68 +655,6 @@
           </w:tcPr>
           <w:p>
             <w:r/>
-          </w:p>
-        </w:tc>
-      </w:tr>
-      <w:tr>
-        <w:tc>
-          <w:tcPr>
-            <w:tcW w:type="dxa" w:w="2428"/>
-          </w:tcPr>
-          <w:p>
-            <w:r>
-              <w:t>1</w:t>
-            </w:r>
-          </w:p>
-        </w:tc>
-        <w:tc>
-          <w:tcPr>
-            <w:tcW w:type="dxa" w:w="2428"/>
-          </w:tcPr>
-          <w:p>
-            <w:r>
-              <w:t>PX1</w:t>
-            </w:r>
-          </w:p>
-        </w:tc>
-        <w:tc>
-          <w:tcPr>
-            <w:tcW w:type="dxa" w:w="2428"/>
-          </w:tcPr>
-          <w:p>
-            <w:r>
-              <w:t>Đồ thị nồng độ đi tới cân bằng từ hai phía</w:t>
-            </w:r>
-          </w:p>
-        </w:tc>
-        <w:tc>
-          <w:tcPr>
-            <w:tcW w:type="dxa" w:w="2428"/>
-          </w:tcPr>
-          <w:p>
-            <w:r>
-              <w:t>✓ Đã duyệt</w:t>
-            </w:r>
-          </w:p>
-        </w:tc>
-        <w:tc>
-          <w:tcPr>
-            <w:tcW w:type="dxa" w:w="2428"/>
-          </w:tcPr>
-          <w:p>
-            <w:r>
-              <w:t>tham khảo SCH 4U, Unit 5 Chemical Equilibrium</w:t>
-            </w:r>
-          </w:p>
-        </w:tc>
-        <w:tc>
-          <w:tcPr>
-            <w:tcW w:type="dxa" w:w="2428"/>
-          </w:tcPr>
-          <w:p>
-            <w:r>
-              <w:t>Vẽ theo số liệu PX1. Chỉ có trong bản GV (đáp án PX1 ý 4), không đưa vào bản HS vì lộ đáp án</w:t>
-            </w:r>
           </w:p>
         </w:tc>
       </w:tr>

</xml_diff>